<commit_message>
how it works: Give the methodology document the same surfaces.
The document is read alongside the app, so it should look like it
belongs to the same project.

Cards, tables, diagrams and the table of contents pick up the glass
treatment. Tables needed separate borders rather than collapsed ones to
keep their rounded corners, and the print stylesheet forces everything
back to opaque with no shadows, because a blurred translucent panel
prints as grey mud. The docx is regenerated from the HTML.
</commit_message>
<xml_diff>
--- a/docs/how-it-works.docx
+++ b/docs/how-it-works.docx
@@ -10,32 +10,6 @@
         <w:t xml:space="preserve">Palestinian User Protection Platform from Digital Fraud: Methodology &amp; Design</w:t>
       </w:r>
     </w:p>
-    <w:sdt>
-      <w:sdtPr>
-        <w:docPartObj>
-          <w:docPartGallery w:val="Table of Contents"/>
-          <w:docPartUnique/>
-        </w:docPartObj>
-      </w:sdtPr>
-      <w:sdtContent>
-        <w:p>
-          <w:pPr>
-            <w:pStyle w:val="TOCHeading"/>
-          </w:pPr>
-          <w:r>
-            <w:t xml:space="preserve">Table of Contents</w:t>
-          </w:r>
-        </w:p>
-        <w:p>
-          <w:r>
-            <w:fldChar w:fldCharType="begin" w:dirty="true"/>
-            <w:instrText xml:space="preserve">TOC \o "1-2" \h \z \u</w:instrText>
-            <w:fldChar w:fldCharType="separate"/>
-            <w:fldChar w:fldCharType="end"/>
-          </w:r>
-        </w:p>
-      </w:sdtContent>
-    </w:sdt>
     <w:bookmarkStart w:id="20" w:name="Xcb41b8bc353cc0cf3e9e71ae9a53c620473ec36"/>
     <w:p>
       <w:pPr>
@@ -75,27 +49,6 @@
       </w:pPr>
       <w:r>
         <w:t xml:space="preserve">Supervisor: Hadi Alnabriss</w:t>
-      </w:r>
-    </w:p>
-    <w:p>
-      <w:pPr>
-        <w:pStyle w:val="BodyText"/>
-      </w:pPr>
-      <w:r>
-        <w:t xml:space="preserve">Describes the system</w:t>
-      </w:r>
-      <w:r>
-        <w:t xml:space="preserve"> </w:t>
-      </w:r>
-      <w:r>
-        <w:rPr>
-          <w:b/>
-          <w:bCs/>
-        </w:rPr>
-        <w:t xml:space="preserve">as implemented</w:t>
-      </w:r>
-      <w:r>
-        <w:t xml:space="preserve">. Milestones 1 to 5 are complete (§14); the accuracy evaluation of §13.1 is still pending its labeled corpus.</w:t>
       </w:r>
     </w:p>
     <w:bookmarkEnd w:id="20"/>
@@ -209,7 +162,7 @@
           <w:rPr>
             <w:rStyle w:val="Hyperlink"/>
           </w:rPr>
-          <w:t xml:space="preserve">Q1. How do we determine that a link is suspicious?</w:t>
+          <w:t xml:space="preserve">How we judge whether a link is suspicious</w:t>
         </w:r>
       </w:hyperlink>
     </w:p>
@@ -226,7 +179,7 @@
           <w:rPr>
             <w:rStyle w:val="Hyperlink"/>
           </w:rPr>
-          <w:t xml:space="preserve">Q2. How do we know how many people visited a link?</w:t>
+          <w:t xml:space="preserve">How far a link has spread</w:t>
         </w:r>
       </w:hyperlink>
     </w:p>
@@ -243,7 +196,7 @@
           <w:rPr>
             <w:rStyle w:val="Hyperlink"/>
           </w:rPr>
-          <w:t xml:space="preserve">Q3. How do we “monitor” users who visited links?</w:t>
+          <w:t xml:space="preserve">Protecting people without monitoring them</w:t>
         </w:r>
       </w:hyperlink>
     </w:p>
@@ -1528,7 +1481,7 @@
       <w:r>
         <w:drawing>
           <wp:inline>
-            <wp:extent cx="5334000" cy="4569245"/>
+            <wp:extent cx="5334000" cy="4565542"/>
             <wp:effectExtent b="0" l="0" r="0" t="0"/>
             <wp:docPr descr="" title="" id="34" name="Picture"/>
             <a:graphic>
@@ -1549,7 +1502,7 @@
                   <pic:spPr bwMode="auto">
                     <a:xfrm>
                       <a:off x="0" y="0"/>
-                      <a:ext cx="5334000" cy="4569245"/>
+                      <a:ext cx="5334000" cy="4565542"/>
                     </a:xfrm>
                     <a:prstGeom prst="rect">
                       <a:avLst/>
@@ -1993,7 +1946,7 @@
       <w:r>
         <w:drawing>
           <wp:inline>
-            <wp:extent cx="5334000" cy="597665"/>
+            <wp:extent cx="5334000" cy="594101"/>
             <wp:effectExtent b="0" l="0" r="0" t="0"/>
             <wp:docPr descr="" title="" id="38" name="Picture"/>
             <a:graphic>
@@ -2014,7 +1967,7 @@
                   <pic:spPr bwMode="auto">
                     <a:xfrm>
                       <a:off x="0" y="0"/>
-                      <a:ext cx="5334000" cy="597665"/>
+                      <a:ext cx="5334000" cy="594101"/>
                     </a:xfrm>
                     <a:prstGeom prst="rect">
                       <a:avLst/>
@@ -2311,28 +2264,12 @@
         <w:t xml:space="preserve">6.</w:t>
       </w:r>
       <w:r>
-        <w:t xml:space="preserve">Q1. How do we determine that a link is suspicious?</w:t>
+        <w:t xml:space="preserve">How we judge whether a link is suspicious</w:t>
       </w:r>
     </w:p>
     <w:p>
       <w:pPr>
         <w:pStyle w:val="FirstParagraph"/>
-      </w:pPr>
-      <w:r>
-        <w:t xml:space="preserve">Professor's question</w:t>
-      </w:r>
-    </w:p>
-    <w:p>
-      <w:pPr>
-        <w:pStyle w:val="BodyText"/>
-      </w:pPr>
-      <w:r>
-        <w:t xml:space="preserve">“How will you decide whether a link is suspicious?”</w:t>
-      </w:r>
-    </w:p>
-    <w:p>
-      <w:pPr>
-        <w:pStyle w:val="BodyText"/>
       </w:pPr>
       <w:r>
         <w:t xml:space="preserve">No single clue is enough on its own, so the engine looks at three kinds at once: what the link itself says,</w:t>
@@ -3334,7 +3271,7 @@
       <w:r>
         <w:drawing>
           <wp:inline>
-            <wp:extent cx="5334000" cy="2307115"/>
+            <wp:extent cx="5334000" cy="2311830"/>
             <wp:effectExtent b="0" l="0" r="0" t="0"/>
             <wp:docPr descr="" title="" id="48" name="Picture"/>
             <a:graphic>
@@ -3355,7 +3292,7 @@
                   <pic:spPr bwMode="auto">
                     <a:xfrm>
                       <a:off x="0" y="0"/>
-                      <a:ext cx="5334000" cy="2307115"/>
+                      <a:ext cx="5334000" cy="2311830"/>
                     </a:xfrm>
                     <a:prstGeom prst="rect">
                       <a:avLst/>
@@ -3393,28 +3330,12 @@
         <w:t xml:space="preserve">7.</w:t>
       </w:r>
       <w:r>
-        <w:t xml:space="preserve">Q2. How do we know how many people visited a link?</w:t>
+        <w:t xml:space="preserve">How far a link has spread</w:t>
       </w:r>
     </w:p>
     <w:p>
       <w:pPr>
         <w:pStyle w:val="FirstParagraph"/>
-      </w:pPr>
-      <w:r>
-        <w:t xml:space="preserve">Professor's question</w:t>
-      </w:r>
-    </w:p>
-    <w:p>
-      <w:pPr>
-        <w:pStyle w:val="BodyText"/>
-      </w:pPr>
-      <w:r>
-        <w:t xml:space="preserve">“How will you know the number of people who visited a specific link?”</w:t>
-      </w:r>
-    </w:p>
-    <w:p>
-      <w:pPr>
-        <w:pStyle w:val="BodyText"/>
       </w:pPr>
       <w:r>
         <w:rPr>
@@ -3881,7 +3802,7 @@
       <w:r>
         <w:drawing>
           <wp:inline>
-            <wp:extent cx="5334000" cy="3810918"/>
+            <wp:extent cx="5334000" cy="3810000"/>
             <wp:effectExtent b="0" l="0" r="0" t="0"/>
             <wp:docPr descr="" title="" id="53" name="Picture"/>
             <a:graphic>
@@ -3902,7 +3823,7 @@
                   <pic:spPr bwMode="auto">
                     <a:xfrm>
                       <a:off x="0" y="0"/>
-                      <a:ext cx="5334000" cy="3810918"/>
+                      <a:ext cx="5334000" cy="3810000"/>
                     </a:xfrm>
                     <a:prstGeom prst="rect">
                       <a:avLst/>
@@ -3971,28 +3892,12 @@
         <w:t xml:space="preserve">8.</w:t>
       </w:r>
       <w:r>
-        <w:t xml:space="preserve">Q3. How do we “monitor” users who visited links?</w:t>
+        <w:t xml:space="preserve">Protecting people without monitoring them</w:t>
       </w:r>
     </w:p>
     <w:p>
       <w:pPr>
         <w:pStyle w:val="FirstParagraph"/>
-      </w:pPr>
-      <w:r>
-        <w:t xml:space="preserve">Professor's question</w:t>
-      </w:r>
-    </w:p>
-    <w:p>
-      <w:pPr>
-        <w:pStyle w:val="BodyText"/>
-      </w:pPr>
-      <w:r>
-        <w:t xml:space="preserve">“How will you monitor the users who visited the links?”</w:t>
-      </w:r>
-    </w:p>
-    <w:p>
-      <w:pPr>
-        <w:pStyle w:val="BodyText"/>
       </w:pPr>
       <w:r>
         <w:rPr>
@@ -4250,7 +4155,7 @@
       <w:r>
         <w:drawing>
           <wp:inline>
-            <wp:extent cx="5334000" cy="3213253"/>
+            <wp:extent cx="5334000" cy="3215898"/>
             <wp:effectExtent b="0" l="0" r="0" t="0"/>
             <wp:docPr descr="" title="" id="57" name="Picture"/>
             <a:graphic>
@@ -4271,7 +4176,7 @@
                   <pic:spPr bwMode="auto">
                     <a:xfrm>
                       <a:off x="0" y="0"/>
-                      <a:ext cx="5334000" cy="3213253"/>
+                      <a:ext cx="5334000" cy="3215898"/>
                     </a:xfrm>
                     <a:prstGeom prst="rect">
                       <a:avLst/>
@@ -5832,7 +5737,7 @@
       <w:r>
         <w:drawing>
           <wp:inline>
-            <wp:extent cx="5334000" cy="2859795"/>
+            <wp:extent cx="5334000" cy="2860728"/>
             <wp:effectExtent b="0" l="0" r="0" t="0"/>
             <wp:docPr descr="" title="" id="66" name="Picture"/>
             <a:graphic>
@@ -5853,7 +5758,7 @@
                   <pic:spPr bwMode="auto">
                     <a:xfrm>
                       <a:off x="0" y="0"/>
-                      <a:ext cx="5334000" cy="2859795"/>
+                      <a:ext cx="5334000" cy="2860728"/>
                     </a:xfrm>
                     <a:prstGeom prst="rect">
                       <a:avLst/>
@@ -5950,7 +5855,7 @@
       <w:r>
         <w:drawing>
           <wp:inline>
-            <wp:extent cx="5334000" cy="3637402"/>
+            <wp:extent cx="5334000" cy="3655016"/>
             <wp:effectExtent b="0" l="0" r="0" t="0"/>
             <wp:docPr descr="" title="" id="70" name="Picture"/>
             <a:graphic>
@@ -5971,7 +5876,7 @@
                   <pic:spPr bwMode="auto">
                     <a:xfrm>
                       <a:off x="0" y="0"/>
-                      <a:ext cx="5334000" cy="3637402"/>
+                      <a:ext cx="5334000" cy="3655016"/>
                     </a:xfrm>
                     <a:prstGeom prst="rect">
                       <a:avLst/>
@@ -6315,7 +6220,7 @@
       <w:r>
         <w:drawing>
           <wp:inline>
-            <wp:extent cx="5334000" cy="1021814"/>
+            <wp:extent cx="5334000" cy="1020305"/>
             <wp:effectExtent b="0" l="0" r="0" t="0"/>
             <wp:docPr descr="" title="" id="74" name="Picture"/>
             <a:graphic>
@@ -6336,7 +6241,7 @@
                   <pic:spPr bwMode="auto">
                     <a:xfrm>
                       <a:off x="0" y="0"/>
-                      <a:ext cx="5334000" cy="1021814"/>
+                      <a:ext cx="5334000" cy="1020305"/>
                     </a:xfrm>
                     <a:prstGeom prst="rect">
                       <a:avLst/>
@@ -7117,7 +7022,7 @@
       <w:r>
         <w:drawing>
           <wp:inline>
-            <wp:extent cx="5334000" cy="1812274"/>
+            <wp:extent cx="5334000" cy="1821050"/>
             <wp:effectExtent b="0" l="0" r="0" t="0"/>
             <wp:docPr descr="" title="" id="81" name="Picture"/>
             <a:graphic>
@@ -7138,7 +7043,7 @@
                   <pic:spPr bwMode="auto">
                     <a:xfrm>
                       <a:off x="0" y="0"/>
-                      <a:ext cx="5334000" cy="1812274"/>
+                      <a:ext cx="5334000" cy="1821050"/>
                     </a:xfrm>
                     <a:prstGeom prst="rect">
                       <a:avLst/>
@@ -7172,9 +7077,8 @@
         <w:tblLook w:firstRow="1" w:lastRow="0" w:firstColumn="0" w:lastColumn="0" w:noHBand="0" w:noVBand="0" w:val="0020"/>
       </w:tblPr>
       <w:tblGrid>
-        <w:gridCol w:w="2640"/>
-        <w:gridCol w:w="2640"/>
-        <w:gridCol w:w="2640"/>
+        <w:gridCol w:w="3960"/>
+        <w:gridCol w:w="3960"/>
       </w:tblGrid>
       <w:tr>
         <w:trPr>
@@ -7202,17 +7106,6 @@
             </w:r>
           </w:p>
         </w:tc>
-        <w:tc>
-          <w:tcPr/>
-          <w:p>
-            <w:pPr>
-              <w:pStyle w:val="Compact"/>
-            </w:pPr>
-            <w:r>
-              <w:t xml:space="preserve">Status</w:t>
-            </w:r>
-          </w:p>
-        </w:tc>
       </w:tr>
       <w:tr>
         <w:tc>
@@ -7237,17 +7130,6 @@
             </w:r>
           </w:p>
         </w:tc>
-        <w:tc>
-          <w:tcPr/>
-          <w:p>
-            <w:pPr>
-              <w:pStyle w:val="Compact"/>
-            </w:pPr>
-            <w:r>
-              <w:t xml:space="preserve">✓ complete</w:t>
-            </w:r>
-          </w:p>
-        </w:tc>
       </w:tr>
       <w:tr>
         <w:tc>
@@ -7272,17 +7154,6 @@
             </w:r>
           </w:p>
         </w:tc>
-        <w:tc>
-          <w:tcPr/>
-          <w:p>
-            <w:pPr>
-              <w:pStyle w:val="Compact"/>
-            </w:pPr>
-            <w:r>
-              <w:t xml:space="preserve">✓ complete</w:t>
-            </w:r>
-          </w:p>
-        </w:tc>
       </w:tr>
       <w:tr>
         <w:tc>
@@ -7307,17 +7178,6 @@
             </w:r>
           </w:p>
         </w:tc>
-        <w:tc>
-          <w:tcPr/>
-          <w:p>
-            <w:pPr>
-              <w:pStyle w:val="Compact"/>
-            </w:pPr>
-            <w:r>
-              <w:t xml:space="preserve">✓ complete</w:t>
-            </w:r>
-          </w:p>
-        </w:tc>
       </w:tr>
       <w:tr>
         <w:tc>
@@ -7342,17 +7202,6 @@
             </w:r>
           </w:p>
         </w:tc>
-        <w:tc>
-          <w:tcPr/>
-          <w:p>
-            <w:pPr>
-              <w:pStyle w:val="Compact"/>
-            </w:pPr>
-            <w:r>
-              <w:t xml:space="preserve">✓ complete</w:t>
-            </w:r>
-          </w:p>
-        </w:tc>
       </w:tr>
       <w:tr>
         <w:tc>
@@ -7377,17 +7226,6 @@
             </w:r>
           </w:p>
         </w:tc>
-        <w:tc>
-          <w:tcPr/>
-          <w:p>
-            <w:pPr>
-              <w:pStyle w:val="Compact"/>
-            </w:pPr>
-            <w:r>
-              <w:t xml:space="preserve">✓ complete</w:t>
-            </w:r>
-          </w:p>
-        </w:tc>
       </w:tr>
       <w:tr>
         <w:tc>
@@ -7412,17 +7250,6 @@
             </w:r>
           </w:p>
         </w:tc>
-        <w:tc>
-          <w:tcPr/>
-          <w:p>
-            <w:pPr>
-              <w:pStyle w:val="Compact"/>
-            </w:pPr>
-            <w:r>
-              <w:t xml:space="preserve">in progress</w:t>
-            </w:r>
-          </w:p>
-        </w:tc>
       </w:tr>
       <w:tr>
         <w:tc>
@@ -7447,17 +7274,6 @@
             </w:r>
           </w:p>
         </w:tc>
-        <w:tc>
-          <w:tcPr/>
-          <w:p>
-            <w:pPr>
-              <w:pStyle w:val="Compact"/>
-            </w:pPr>
-            <w:r>
-              <w:t xml:space="preserve">not started</w:t>
-            </w:r>
-          </w:p>
-        </w:tc>
       </w:tr>
     </w:tbl>
     <w:p>
@@ -7465,7 +7281,7 @@
         <w:pStyle w:val="BodyText"/>
       </w:pPr>
       <w:r>
-        <w:t xml:space="preserve">Table 7. Milestone status at the time of writing. The scope beyond milestone 6 was always designated future work rather than deliverables of this project.</w:t>
+        <w:t xml:space="preserve">Table 7. The milestones and what each covers. The scope listed under Future was always intended as work beyond this project rather than a deliverable of it.</w:t>
       </w:r>
     </w:p>
     <w:bookmarkEnd w:id="83"/>

</xml_diff>